<commit_message>
docs: update project README, refine 8-Puzzle Solver header, and include report lock file
</commit_message>
<xml_diff>
--- a/Report.docx
+++ b/Report.docx
@@ -28,7 +28,14 @@
         </w:rPr>
       </w:pPr>
       <w:r>
-        <w:rPr/>
+        <w:rPr>
+          <w:rFonts w:eastAsia="Arial" w:cs="Arial"/>
+          <w:b/>
+          <w:bCs/>
+          <w:color w:val="1F4E79"/>
+          <w:sz w:val="72"/>
+          <w:szCs w:val="72"/>
+        </w:rPr>
       </w:r>
     </w:p>
     <w:p>
@@ -47,7 +54,14 @@
         </w:rPr>
       </w:pPr>
       <w:r>
-        <w:rPr/>
+        <w:rPr>
+          <w:rFonts w:eastAsia="Arial" w:cs="Arial"/>
+          <w:b/>
+          <w:bCs/>
+          <w:color w:val="1F4E79"/>
+          <w:sz w:val="72"/>
+          <w:szCs w:val="72"/>
+        </w:rPr>
       </w:r>
     </w:p>
     <w:p>
@@ -66,7 +80,14 @@
         </w:rPr>
       </w:pPr>
       <w:r>
-        <w:rPr/>
+        <w:rPr>
+          <w:rFonts w:eastAsia="Arial" w:cs="Arial"/>
+          <w:b/>
+          <w:bCs/>
+          <w:color w:val="1F4E79"/>
+          <w:sz w:val="72"/>
+          <w:szCs w:val="72"/>
+        </w:rPr>
       </w:r>
     </w:p>
     <w:p>
@@ -131,13 +152,13 @@
         </w:tblCellMar>
       </w:tblPr>
       <w:tblGrid>
-        <w:gridCol w:w="7019"/>
+        <w:gridCol w:w="9360"/>
       </w:tblGrid>
       <w:tr>
         <w:trPr/>
         <w:tc>
           <w:tcPr>
-            <w:tcW w:w="7019" w:type="dxa"/>
+            <w:tcW w:w="9360" w:type="dxa"/>
             <w:tcBorders/>
             <w:shd w:fill="D6E4F0" w:val="clear"/>
           </w:tcPr>
@@ -222,15 +243,15 @@
         </w:tblCellMar>
       </w:tblPr>
       <w:tblGrid>
-        <w:gridCol w:w="559"/>
-        <w:gridCol w:w="5205"/>
-        <w:gridCol w:w="2195"/>
+        <w:gridCol w:w="657"/>
+        <w:gridCol w:w="6121"/>
+        <w:gridCol w:w="2582"/>
       </w:tblGrid>
       <w:tr>
         <w:trPr/>
         <w:tc>
           <w:tcPr>
-            <w:tcW w:w="559" w:type="dxa"/>
+            <w:tcW w:w="657" w:type="dxa"/>
             <w:tcBorders>
               <w:top w:val="single" w:sz="2" w:space="0" w:color="CCCCCC"/>
               <w:left w:val="single" w:sz="2" w:space="0" w:color="CCCCCC"/>
@@ -261,7 +282,7 @@
         </w:tc>
         <w:tc>
           <w:tcPr>
-            <w:tcW w:w="5205" w:type="dxa"/>
+            <w:tcW w:w="6121" w:type="dxa"/>
             <w:tcBorders>
               <w:top w:val="single" w:sz="2" w:space="0" w:color="CCCCCC"/>
               <w:left w:val="single" w:sz="2" w:space="0" w:color="CCCCCC"/>
@@ -292,7 +313,7 @@
         </w:tc>
         <w:tc>
           <w:tcPr>
-            <w:tcW w:w="2195" w:type="dxa"/>
+            <w:tcW w:w="2582" w:type="dxa"/>
             <w:tcBorders>
               <w:top w:val="single" w:sz="2" w:space="0" w:color="CCCCCC"/>
               <w:left w:val="single" w:sz="2" w:space="0" w:color="CCCCCC"/>
@@ -328,7 +349,7 @@
         </w:trPr>
         <w:tc>
           <w:tcPr>
-            <w:tcW w:w="559" w:type="dxa"/>
+            <w:tcW w:w="657" w:type="dxa"/>
             <w:tcBorders>
               <w:top w:val="single" w:sz="2" w:space="0" w:color="CCCCCC"/>
               <w:left w:val="single" w:sz="2" w:space="0" w:color="CCCCCC"/>
@@ -360,7 +381,7 @@
         </w:tc>
         <w:tc>
           <w:tcPr>
-            <w:tcW w:w="5205" w:type="dxa"/>
+            <w:tcW w:w="6121" w:type="dxa"/>
             <w:tcBorders>
               <w:top w:val="single" w:sz="2" w:space="0" w:color="CCCCCC"/>
               <w:left w:val="single" w:sz="2" w:space="0" w:color="CCCCCC"/>
@@ -384,7 +405,7 @@
         </w:tc>
         <w:tc>
           <w:tcPr>
-            <w:tcW w:w="2195" w:type="dxa"/>
+            <w:tcW w:w="2582" w:type="dxa"/>
             <w:tcBorders>
               <w:top w:val="single" w:sz="2" w:space="0" w:color="CCCCCC"/>
               <w:left w:val="single" w:sz="2" w:space="0" w:color="CCCCCC"/>
@@ -413,7 +434,7 @@
         </w:trPr>
         <w:tc>
           <w:tcPr>
-            <w:tcW w:w="559" w:type="dxa"/>
+            <w:tcW w:w="657" w:type="dxa"/>
             <w:tcBorders>
               <w:top w:val="single" w:sz="2" w:space="0" w:color="CCCCCC"/>
               <w:left w:val="single" w:sz="2" w:space="0" w:color="CCCCCC"/>
@@ -445,7 +466,7 @@
         </w:tc>
         <w:tc>
           <w:tcPr>
-            <w:tcW w:w="5205" w:type="dxa"/>
+            <w:tcW w:w="6121" w:type="dxa"/>
             <w:tcBorders>
               <w:top w:val="single" w:sz="2" w:space="0" w:color="CCCCCC"/>
               <w:left w:val="single" w:sz="2" w:space="0" w:color="CCCCCC"/>
@@ -469,7 +490,7 @@
         </w:tc>
         <w:tc>
           <w:tcPr>
-            <w:tcW w:w="2195" w:type="dxa"/>
+            <w:tcW w:w="2582" w:type="dxa"/>
             <w:tcBorders>
               <w:top w:val="single" w:sz="2" w:space="0" w:color="CCCCCC"/>
               <w:left w:val="single" w:sz="2" w:space="0" w:color="CCCCCC"/>
@@ -498,7 +519,7 @@
         </w:trPr>
         <w:tc>
           <w:tcPr>
-            <w:tcW w:w="559" w:type="dxa"/>
+            <w:tcW w:w="657" w:type="dxa"/>
             <w:tcBorders>
               <w:top w:val="single" w:sz="2" w:space="0" w:color="CCCCCC"/>
               <w:left w:val="single" w:sz="2" w:space="0" w:color="CCCCCC"/>
@@ -530,7 +551,7 @@
         </w:tc>
         <w:tc>
           <w:tcPr>
-            <w:tcW w:w="5205" w:type="dxa"/>
+            <w:tcW w:w="6121" w:type="dxa"/>
             <w:tcBorders>
               <w:top w:val="single" w:sz="2" w:space="0" w:color="CCCCCC"/>
               <w:left w:val="single" w:sz="2" w:space="0" w:color="CCCCCC"/>
@@ -548,13 +569,17 @@
             </w:pPr>
             <w:r>
               <w:rPr/>
-              <w:t>Farah Ibrahim</w:t>
-            </w:r>
-          </w:p>
-        </w:tc>
-        <w:tc>
-          <w:tcPr>
-            <w:tcW w:w="2195" w:type="dxa"/>
+              <w:t xml:space="preserve">Farah Ibrahim </w:t>
+            </w:r>
+            <w:r>
+              <w:rPr/>
+              <w:t>Alsayed Ibrahim</w:t>
+            </w:r>
+          </w:p>
+        </w:tc>
+        <w:tc>
+          <w:tcPr>
+            <w:tcW w:w="2582" w:type="dxa"/>
             <w:tcBorders>
               <w:top w:val="single" w:sz="2" w:space="0" w:color="CCCCCC"/>
               <w:left w:val="single" w:sz="2" w:space="0" w:color="CCCCCC"/>
@@ -572,6 +597,7 @@
             </w:pPr>
             <w:r>
               <w:rPr/>
+              <w:t>2022170938</w:t>
             </w:r>
           </w:p>
         </w:tc>
@@ -582,7 +608,7 @@
         </w:trPr>
         <w:tc>
           <w:tcPr>
-            <w:tcW w:w="559" w:type="dxa"/>
+            <w:tcW w:w="657" w:type="dxa"/>
             <w:tcBorders>
               <w:top w:val="single" w:sz="2" w:space="0" w:color="CCCCCC"/>
               <w:left w:val="single" w:sz="2" w:space="0" w:color="CCCCCC"/>
@@ -614,7 +640,7 @@
         </w:tc>
         <w:tc>
           <w:tcPr>
-            <w:tcW w:w="5205" w:type="dxa"/>
+            <w:tcW w:w="6121" w:type="dxa"/>
             <w:tcBorders>
               <w:top w:val="single" w:sz="2" w:space="0" w:color="CCCCCC"/>
               <w:left w:val="single" w:sz="2" w:space="0" w:color="CCCCCC"/>
@@ -638,7 +664,7 @@
         </w:tc>
         <w:tc>
           <w:tcPr>
-            <w:tcW w:w="2195" w:type="dxa"/>
+            <w:tcW w:w="2582" w:type="dxa"/>
             <w:tcBorders>
               <w:top w:val="single" w:sz="2" w:space="0" w:color="CCCCCC"/>
               <w:left w:val="single" w:sz="2" w:space="0" w:color="CCCCCC"/>
@@ -865,7 +891,7 @@
         <w:pStyle w:val="ListParagraph"/>
         <w:numPr>
           <w:ilvl w:val="0"/>
-          <w:numId w:val="3"/>
+          <w:numId w:val="4"/>
         </w:numPr>
         <w:spacing w:before="40" w:after="40"/>
         <w:rPr/>
@@ -885,7 +911,7 @@
         <w:pStyle w:val="ListParagraph"/>
         <w:numPr>
           <w:ilvl w:val="0"/>
-          <w:numId w:val="2"/>
+          <w:numId w:val="5"/>
         </w:numPr>
         <w:spacing w:before="40" w:after="40"/>
         <w:rPr/>
@@ -905,7 +931,7 @@
         <w:pStyle w:val="ListParagraph"/>
         <w:numPr>
           <w:ilvl w:val="0"/>
-          <w:numId w:val="2"/>
+          <w:numId w:val="6"/>
         </w:numPr>
         <w:spacing w:before="40" w:after="40"/>
         <w:rPr/>
@@ -925,7 +951,7 @@
         <w:pStyle w:val="ListParagraph"/>
         <w:numPr>
           <w:ilvl w:val="0"/>
-          <w:numId w:val="2"/>
+          <w:numId w:val="7"/>
         </w:numPr>
         <w:spacing w:before="40" w:after="40"/>
         <w:rPr/>
@@ -945,7 +971,7 @@
         <w:pStyle w:val="ListParagraph"/>
         <w:numPr>
           <w:ilvl w:val="0"/>
-          <w:numId w:val="2"/>
+          <w:numId w:val="8"/>
         </w:numPr>
         <w:spacing w:before="40" w:after="40"/>
         <w:rPr/>
@@ -5568,16 +5594,8 @@
               <w:rPr/>
             </w:pPr>
             <w:r>
-              <w:rPr>
-                <w:rFonts w:eastAsia="Arial" w:cs="Arial"/>
-                <w:i/>
-                <w:iCs/>
-                <w:color w:val="404040"/>
-                <w:sz w:val="20"/>
-                <w:szCs w:val="20"/>
-              </w:rPr>
               <w:drawing>
-                <wp:anchor behindDoc="0" distT="0" distB="0" distL="0" distR="0" simplePos="0" locked="0" layoutInCell="0" allowOverlap="1" relativeHeight="2">
+                <wp:anchor behindDoc="0" distT="0" distB="0" distL="0" distR="0" simplePos="0" locked="0" layoutInCell="1" allowOverlap="1" relativeHeight="2">
                   <wp:simplePos x="0" y="0"/>
                   <wp:positionH relativeFrom="column">
                     <wp:align>center</wp:align>
@@ -5706,16 +5724,8 @@
               <w:rPr/>
             </w:pPr>
             <w:r>
-              <w:rPr>
-                <w:rFonts w:eastAsia="Arial" w:cs="Arial"/>
-                <w:i/>
-                <w:iCs/>
-                <w:color w:val="404040"/>
-                <w:sz w:val="20"/>
-                <w:szCs w:val="20"/>
-              </w:rPr>
               <w:drawing>
-                <wp:anchor behindDoc="0" distT="0" distB="0" distL="0" distR="0" simplePos="0" locked="0" layoutInCell="0" allowOverlap="1" relativeHeight="3">
+                <wp:anchor behindDoc="0" distT="0" distB="0" distL="0" distR="0" simplePos="0" locked="0" layoutInCell="1" allowOverlap="1" relativeHeight="3">
                   <wp:simplePos x="0" y="0"/>
                   <wp:positionH relativeFrom="column">
                     <wp:align>center</wp:align>
@@ -5844,16 +5854,8 @@
               <w:rPr/>
             </w:pPr>
             <w:r>
-              <w:rPr>
-                <w:rFonts w:eastAsia="Arial" w:cs="Arial"/>
-                <w:i/>
-                <w:iCs/>
-                <w:color w:val="404040"/>
-                <w:sz w:val="20"/>
-                <w:szCs w:val="20"/>
-              </w:rPr>
               <w:drawing>
-                <wp:anchor behindDoc="0" distT="0" distB="0" distL="0" distR="0" simplePos="0" locked="0" layoutInCell="0" allowOverlap="1" relativeHeight="4">
+                <wp:anchor behindDoc="0" distT="0" distB="0" distL="0" distR="0" simplePos="0" locked="0" layoutInCell="1" allowOverlap="1" relativeHeight="4">
                   <wp:simplePos x="0" y="0"/>
                   <wp:positionH relativeFrom="column">
                     <wp:align>center</wp:align>
@@ -5982,16 +5984,8 @@
               <w:rPr/>
             </w:pPr>
             <w:r>
-              <w:rPr>
-                <w:rFonts w:eastAsia="Arial" w:cs="Arial"/>
-                <w:i/>
-                <w:iCs/>
-                <w:color w:val="404040"/>
-                <w:sz w:val="20"/>
-                <w:szCs w:val="20"/>
-              </w:rPr>
               <w:drawing>
-                <wp:anchor behindDoc="0" distT="0" distB="0" distL="0" distR="0" simplePos="0" locked="0" layoutInCell="0" allowOverlap="1" relativeHeight="5">
+                <wp:anchor behindDoc="0" distT="0" distB="0" distL="0" distR="0" simplePos="0" locked="0" layoutInCell="1" allowOverlap="1" relativeHeight="5">
                   <wp:simplePos x="0" y="0"/>
                   <wp:positionH relativeFrom="column">
                     <wp:align>center</wp:align>
@@ -6147,9 +6141,16 @@
               </w:rPr>
             </w:pPr>
             <w:r>
-              <w:rPr/>
+              <w:rPr>
+                <w:rFonts w:eastAsia="Arial" w:cs="Arial"/>
+                <w:i/>
+                <w:iCs/>
+                <w:color w:val="888888"/>
+                <w:sz w:val="20"/>
+                <w:szCs w:val="20"/>
+              </w:rPr>
               <w:drawing>
-                <wp:anchor behindDoc="0" distT="0" distB="0" distL="0" distR="0" simplePos="0" locked="0" layoutInCell="0" allowOverlap="1" relativeHeight="6">
+                <wp:anchor behindDoc="0" distT="0" distB="0" distL="0" distR="0" simplePos="0" locked="0" layoutInCell="1" allowOverlap="1" relativeHeight="6">
                   <wp:simplePos x="0" y="0"/>
                   <wp:positionH relativeFrom="column">
                     <wp:align>center</wp:align>
@@ -7744,16 +7745,8 @@
               <w:rPr/>
             </w:pPr>
             <w:r>
-              <w:rPr>
-                <w:rFonts w:eastAsia="Arial" w:cs="Arial"/>
-                <w:i/>
-                <w:iCs/>
-                <w:color w:val="404040"/>
-                <w:sz w:val="20"/>
-                <w:szCs w:val="20"/>
-              </w:rPr>
               <w:drawing>
-                <wp:anchor behindDoc="0" distT="0" distB="0" distL="0" distR="0" simplePos="0" locked="0" layoutInCell="0" allowOverlap="1" relativeHeight="7">
+                <wp:anchor behindDoc="0" distT="0" distB="0" distL="0" distR="0" simplePos="0" locked="0" layoutInCell="1" allowOverlap="1" relativeHeight="7">
                   <wp:simplePos x="0" y="0"/>
                   <wp:positionH relativeFrom="column">
                     <wp:align>center</wp:align>
@@ -7885,7 +7878,7 @@
             </w:pPr>
             <w:r>
               <w:drawing>
-                <wp:anchor behindDoc="0" distT="0" distB="0" distL="0" distR="0" simplePos="0" locked="0" layoutInCell="0" allowOverlap="1" relativeHeight="8">
+                <wp:anchor behindDoc="0" distT="0" distB="0" distL="0" distR="0" simplePos="0" locked="0" layoutInCell="1" allowOverlap="1" relativeHeight="8">
                   <wp:simplePos x="0" y="0"/>
                   <wp:positionH relativeFrom="column">
                     <wp:posOffset>54610</wp:posOffset>
@@ -7930,7 +7923,7 @@
                 </wp:anchor>
               </w:drawing>
               <w:drawing>
-                <wp:anchor behindDoc="0" distT="0" distB="0" distL="0" distR="0" simplePos="0" locked="0" layoutInCell="0" allowOverlap="1" relativeHeight="9">
+                <wp:anchor behindDoc="0" distT="0" distB="0" distL="0" distR="0" simplePos="0" locked="0" layoutInCell="1" allowOverlap="1" relativeHeight="9">
                   <wp:simplePos x="0" y="0"/>
                   <wp:positionH relativeFrom="column">
                     <wp:posOffset>61595</wp:posOffset>
@@ -8003,7 +7996,7 @@
             </w:pPr>
             <w:r>
               <w:drawing>
-                <wp:anchor behindDoc="0" distT="0" distB="0" distL="0" distR="0" simplePos="0" locked="0" layoutInCell="0" allowOverlap="1" relativeHeight="10">
+                <wp:anchor behindDoc="0" distT="0" distB="0" distL="0" distR="0" simplePos="0" locked="0" layoutInCell="1" allowOverlap="1" relativeHeight="10">
                   <wp:simplePos x="0" y="0"/>
                   <wp:positionH relativeFrom="column">
                     <wp:align>center</wp:align>
@@ -8063,7 +8056,7 @@
             </w:pPr>
             <w:r>
               <w:drawing>
-                <wp:anchor behindDoc="0" distT="0" distB="0" distL="0" distR="0" simplePos="0" locked="0" layoutInCell="0" allowOverlap="1" relativeHeight="11">
+                <wp:anchor behindDoc="0" distT="0" distB="0" distL="0" distR="0" simplePos="0" locked="0" layoutInCell="1" allowOverlap="1" relativeHeight="11">
                   <wp:simplePos x="0" y="0"/>
                   <wp:positionH relativeFrom="column">
                     <wp:align>center</wp:align>
@@ -8123,7 +8116,7 @@
             </w:pPr>
             <w:r>
               <w:drawing>
-                <wp:anchor behindDoc="0" distT="0" distB="0" distL="0" distR="0" simplePos="0" locked="0" layoutInCell="0" allowOverlap="1" relativeHeight="12">
+                <wp:anchor behindDoc="0" distT="0" distB="0" distL="0" distR="0" simplePos="0" locked="0" layoutInCell="1" allowOverlap="1" relativeHeight="12">
                   <wp:simplePos x="0" y="0"/>
                   <wp:positionH relativeFrom="column">
                     <wp:align>center</wp:align>
@@ -9330,125 +9323,6 @@
   <w:abstractNum w:abstractNumId="1">
     <w:lvl w:ilvl="0">
       <w:start w:val="1"/>
-      <w:numFmt w:val="none"/>
-      <w:suff w:val="nothing"/>
-      <w:lvlText w:val=""/>
-      <w:lvlJc w:val="left"/>
-      <w:pPr>
-        <w:tabs>
-          <w:tab w:val="num" w:pos="0"/>
-        </w:tabs>
-        <w:ind w:left="0" w:hanging="0"/>
-      </w:pPr>
-    </w:lvl>
-    <w:lvl w:ilvl="1">
-      <w:start w:val="1"/>
-      <w:numFmt w:val="none"/>
-      <w:suff w:val="nothing"/>
-      <w:lvlText w:val=""/>
-      <w:lvlJc w:val="left"/>
-      <w:pPr>
-        <w:tabs>
-          <w:tab w:val="num" w:pos="0"/>
-        </w:tabs>
-        <w:ind w:left="0" w:hanging="0"/>
-      </w:pPr>
-    </w:lvl>
-    <w:lvl w:ilvl="2">
-      <w:start w:val="1"/>
-      <w:numFmt w:val="none"/>
-      <w:suff w:val="nothing"/>
-      <w:lvlText w:val=""/>
-      <w:lvlJc w:val="left"/>
-      <w:pPr>
-        <w:tabs>
-          <w:tab w:val="num" w:pos="0"/>
-        </w:tabs>
-        <w:ind w:left="0" w:hanging="0"/>
-      </w:pPr>
-    </w:lvl>
-    <w:lvl w:ilvl="3">
-      <w:start w:val="1"/>
-      <w:numFmt w:val="none"/>
-      <w:suff w:val="nothing"/>
-      <w:lvlText w:val=""/>
-      <w:lvlJc w:val="left"/>
-      <w:pPr>
-        <w:tabs>
-          <w:tab w:val="num" w:pos="0"/>
-        </w:tabs>
-        <w:ind w:left="0" w:hanging="0"/>
-      </w:pPr>
-    </w:lvl>
-    <w:lvl w:ilvl="4">
-      <w:start w:val="1"/>
-      <w:numFmt w:val="none"/>
-      <w:suff w:val="nothing"/>
-      <w:lvlText w:val=""/>
-      <w:lvlJc w:val="left"/>
-      <w:pPr>
-        <w:tabs>
-          <w:tab w:val="num" w:pos="0"/>
-        </w:tabs>
-        <w:ind w:left="0" w:hanging="0"/>
-      </w:pPr>
-    </w:lvl>
-    <w:lvl w:ilvl="5">
-      <w:start w:val="1"/>
-      <w:numFmt w:val="none"/>
-      <w:suff w:val="nothing"/>
-      <w:lvlText w:val=""/>
-      <w:lvlJc w:val="left"/>
-      <w:pPr>
-        <w:tabs>
-          <w:tab w:val="num" w:pos="0"/>
-        </w:tabs>
-        <w:ind w:left="0" w:hanging="0"/>
-      </w:pPr>
-    </w:lvl>
-    <w:lvl w:ilvl="6">
-      <w:start w:val="1"/>
-      <w:numFmt w:val="none"/>
-      <w:suff w:val="nothing"/>
-      <w:lvlText w:val=""/>
-      <w:lvlJc w:val="left"/>
-      <w:pPr>
-        <w:tabs>
-          <w:tab w:val="num" w:pos="0"/>
-        </w:tabs>
-        <w:ind w:left="0" w:hanging="0"/>
-      </w:pPr>
-    </w:lvl>
-    <w:lvl w:ilvl="7">
-      <w:start w:val="1"/>
-      <w:numFmt w:val="none"/>
-      <w:suff w:val="nothing"/>
-      <w:lvlText w:val=""/>
-      <w:lvlJc w:val="left"/>
-      <w:pPr>
-        <w:tabs>
-          <w:tab w:val="num" w:pos="0"/>
-        </w:tabs>
-        <w:ind w:left="0" w:hanging="0"/>
-      </w:pPr>
-    </w:lvl>
-    <w:lvl w:ilvl="8">
-      <w:start w:val="1"/>
-      <w:numFmt w:val="none"/>
-      <w:suff w:val="nothing"/>
-      <w:lvlText w:val=""/>
-      <w:lvlJc w:val="left"/>
-      <w:pPr>
-        <w:tabs>
-          <w:tab w:val="num" w:pos="0"/>
-        </w:tabs>
-        <w:ind w:left="0" w:hanging="0"/>
-      </w:pPr>
-    </w:lvl>
-  </w:abstractNum>
-  <w:abstractNum w:abstractNumId="2">
-    <w:lvl w:ilvl="0">
-      <w:start w:val="1"/>
       <w:numFmt w:val="bullet"/>
       <w:lvlText w:val=""/>
       <w:lvlJc w:val="left"/>
@@ -9473,6 +9347,7 @@
         </w:tabs>
         <w:ind w:left="1080" w:hanging="360"/>
       </w:pPr>
+      <w:rPr/>
     </w:lvl>
     <w:lvl w:ilvl="2">
       <w:start w:val="1"/>
@@ -9485,6 +9360,7 @@
         </w:tabs>
         <w:ind w:left="1440" w:hanging="360"/>
       </w:pPr>
+      <w:rPr/>
     </w:lvl>
     <w:lvl w:ilvl="3">
       <w:start w:val="1"/>
@@ -9497,6 +9373,7 @@
         </w:tabs>
         <w:ind w:left="1800" w:hanging="360"/>
       </w:pPr>
+      <w:rPr/>
     </w:lvl>
     <w:lvl w:ilvl="4">
       <w:start w:val="1"/>
@@ -9509,6 +9386,7 @@
         </w:tabs>
         <w:ind w:left="2160" w:hanging="360"/>
       </w:pPr>
+      <w:rPr/>
     </w:lvl>
     <w:lvl w:ilvl="5">
       <w:start w:val="1"/>
@@ -9521,6 +9399,7 @@
         </w:tabs>
         <w:ind w:left="2520" w:hanging="360"/>
       </w:pPr>
+      <w:rPr/>
     </w:lvl>
     <w:lvl w:ilvl="6">
       <w:start w:val="1"/>
@@ -9533,6 +9412,7 @@
         </w:tabs>
         <w:ind w:left="2880" w:hanging="360"/>
       </w:pPr>
+      <w:rPr/>
     </w:lvl>
     <w:lvl w:ilvl="7">
       <w:start w:val="1"/>
@@ -9545,6 +9425,7 @@
         </w:tabs>
         <w:ind w:left="3240" w:hanging="360"/>
       </w:pPr>
+      <w:rPr/>
     </w:lvl>
     <w:lvl w:ilvl="8">
       <w:start w:val="1"/>
@@ -9556,6 +9437,247 @@
           <w:tab w:val="num" w:pos="3600"/>
         </w:tabs>
         <w:ind w:left="3600" w:hanging="360"/>
+      </w:pPr>
+      <w:rPr/>
+    </w:lvl>
+  </w:abstractNum>
+  <w:abstractNum w:abstractNumId="2">
+    <w:lvl w:ilvl="0">
+      <w:start w:val="1"/>
+      <w:numFmt w:val="bullet"/>
+      <w:lvlText w:val=""/>
+      <w:lvlJc w:val="left"/>
+      <w:pPr>
+        <w:tabs>
+          <w:tab w:val="num" w:pos="0"/>
+        </w:tabs>
+        <w:ind w:left="720" w:hanging="360"/>
+      </w:pPr>
+      <w:rPr>
+        <w:rFonts w:ascii="Symbol" w:hAnsi="Symbol" w:cs="Symbol" w:hint="default"/>
+      </w:rPr>
+    </w:lvl>
+    <w:lvl w:ilvl="1">
+      <w:start w:val="1"/>
+      <w:numFmt w:val="decimal"/>
+      <w:lvlText w:val="%2."/>
+      <w:lvlJc w:val="left"/>
+      <w:pPr>
+        <w:tabs>
+          <w:tab w:val="num" w:pos="1080"/>
+        </w:tabs>
+        <w:ind w:left="1080" w:hanging="360"/>
+      </w:pPr>
+      <w:rPr/>
+    </w:lvl>
+    <w:lvl w:ilvl="2">
+      <w:start w:val="1"/>
+      <w:numFmt w:val="decimal"/>
+      <w:lvlText w:val="%3."/>
+      <w:lvlJc w:val="left"/>
+      <w:pPr>
+        <w:tabs>
+          <w:tab w:val="num" w:pos="1440"/>
+        </w:tabs>
+        <w:ind w:left="1440" w:hanging="360"/>
+      </w:pPr>
+      <w:rPr/>
+    </w:lvl>
+    <w:lvl w:ilvl="3">
+      <w:start w:val="1"/>
+      <w:numFmt w:val="decimal"/>
+      <w:lvlText w:val="%4."/>
+      <w:lvlJc w:val="left"/>
+      <w:pPr>
+        <w:tabs>
+          <w:tab w:val="num" w:pos="1800"/>
+        </w:tabs>
+        <w:ind w:left="1800" w:hanging="360"/>
+      </w:pPr>
+      <w:rPr/>
+    </w:lvl>
+    <w:lvl w:ilvl="4">
+      <w:start w:val="1"/>
+      <w:numFmt w:val="decimal"/>
+      <w:lvlText w:val="%5."/>
+      <w:lvlJc w:val="left"/>
+      <w:pPr>
+        <w:tabs>
+          <w:tab w:val="num" w:pos="2160"/>
+        </w:tabs>
+        <w:ind w:left="2160" w:hanging="360"/>
+      </w:pPr>
+      <w:rPr/>
+    </w:lvl>
+    <w:lvl w:ilvl="5">
+      <w:start w:val="1"/>
+      <w:numFmt w:val="decimal"/>
+      <w:lvlText w:val="%6."/>
+      <w:lvlJc w:val="left"/>
+      <w:pPr>
+        <w:tabs>
+          <w:tab w:val="num" w:pos="2520"/>
+        </w:tabs>
+        <w:ind w:left="2520" w:hanging="360"/>
+      </w:pPr>
+      <w:rPr/>
+    </w:lvl>
+    <w:lvl w:ilvl="6">
+      <w:start w:val="1"/>
+      <w:numFmt w:val="decimal"/>
+      <w:lvlText w:val="%7."/>
+      <w:lvlJc w:val="left"/>
+      <w:pPr>
+        <w:tabs>
+          <w:tab w:val="num" w:pos="2880"/>
+        </w:tabs>
+        <w:ind w:left="2880" w:hanging="360"/>
+      </w:pPr>
+      <w:rPr/>
+    </w:lvl>
+    <w:lvl w:ilvl="7">
+      <w:start w:val="1"/>
+      <w:numFmt w:val="decimal"/>
+      <w:lvlText w:val="%8."/>
+      <w:lvlJc w:val="left"/>
+      <w:pPr>
+        <w:tabs>
+          <w:tab w:val="num" w:pos="3240"/>
+        </w:tabs>
+        <w:ind w:left="3240" w:hanging="360"/>
+      </w:pPr>
+      <w:rPr/>
+    </w:lvl>
+    <w:lvl w:ilvl="8">
+      <w:start w:val="1"/>
+      <w:numFmt w:val="decimal"/>
+      <w:lvlText w:val="%9."/>
+      <w:lvlJc w:val="left"/>
+      <w:pPr>
+        <w:tabs>
+          <w:tab w:val="num" w:pos="3600"/>
+        </w:tabs>
+        <w:ind w:left="3600" w:hanging="360"/>
+      </w:pPr>
+      <w:rPr/>
+    </w:lvl>
+  </w:abstractNum>
+  <w:abstractNum w:abstractNumId="3">
+    <w:lvl w:ilvl="0">
+      <w:start w:val="1"/>
+      <w:numFmt w:val="none"/>
+      <w:suff w:val="nothing"/>
+      <w:lvlText w:val=""/>
+      <w:lvlJc w:val="left"/>
+      <w:pPr>
+        <w:tabs>
+          <w:tab w:val="num" w:pos="0"/>
+        </w:tabs>
+        <w:ind w:left="0" w:hanging="0"/>
+      </w:pPr>
+    </w:lvl>
+    <w:lvl w:ilvl="1">
+      <w:start w:val="1"/>
+      <w:numFmt w:val="none"/>
+      <w:suff w:val="nothing"/>
+      <w:lvlText w:val=""/>
+      <w:lvlJc w:val="left"/>
+      <w:pPr>
+        <w:tabs>
+          <w:tab w:val="num" w:pos="0"/>
+        </w:tabs>
+        <w:ind w:left="0" w:hanging="0"/>
+      </w:pPr>
+    </w:lvl>
+    <w:lvl w:ilvl="2">
+      <w:start w:val="1"/>
+      <w:numFmt w:val="none"/>
+      <w:suff w:val="nothing"/>
+      <w:lvlText w:val=""/>
+      <w:lvlJc w:val="left"/>
+      <w:pPr>
+        <w:tabs>
+          <w:tab w:val="num" w:pos="0"/>
+        </w:tabs>
+        <w:ind w:left="0" w:hanging="0"/>
+      </w:pPr>
+    </w:lvl>
+    <w:lvl w:ilvl="3">
+      <w:start w:val="1"/>
+      <w:numFmt w:val="none"/>
+      <w:suff w:val="nothing"/>
+      <w:lvlText w:val=""/>
+      <w:lvlJc w:val="left"/>
+      <w:pPr>
+        <w:tabs>
+          <w:tab w:val="num" w:pos="0"/>
+        </w:tabs>
+        <w:ind w:left="0" w:hanging="0"/>
+      </w:pPr>
+    </w:lvl>
+    <w:lvl w:ilvl="4">
+      <w:start w:val="1"/>
+      <w:numFmt w:val="none"/>
+      <w:suff w:val="nothing"/>
+      <w:lvlText w:val=""/>
+      <w:lvlJc w:val="left"/>
+      <w:pPr>
+        <w:tabs>
+          <w:tab w:val="num" w:pos="0"/>
+        </w:tabs>
+        <w:ind w:left="0" w:hanging="0"/>
+      </w:pPr>
+    </w:lvl>
+    <w:lvl w:ilvl="5">
+      <w:start w:val="1"/>
+      <w:numFmt w:val="none"/>
+      <w:suff w:val="nothing"/>
+      <w:lvlText w:val=""/>
+      <w:lvlJc w:val="left"/>
+      <w:pPr>
+        <w:tabs>
+          <w:tab w:val="num" w:pos="0"/>
+        </w:tabs>
+        <w:ind w:left="0" w:hanging="0"/>
+      </w:pPr>
+    </w:lvl>
+    <w:lvl w:ilvl="6">
+      <w:start w:val="1"/>
+      <w:numFmt w:val="none"/>
+      <w:suff w:val="nothing"/>
+      <w:lvlText w:val=""/>
+      <w:lvlJc w:val="left"/>
+      <w:pPr>
+        <w:tabs>
+          <w:tab w:val="num" w:pos="0"/>
+        </w:tabs>
+        <w:ind w:left="0" w:hanging="0"/>
+      </w:pPr>
+    </w:lvl>
+    <w:lvl w:ilvl="7">
+      <w:start w:val="1"/>
+      <w:numFmt w:val="none"/>
+      <w:suff w:val="nothing"/>
+      <w:lvlText w:val=""/>
+      <w:lvlJc w:val="left"/>
+      <w:pPr>
+        <w:tabs>
+          <w:tab w:val="num" w:pos="0"/>
+        </w:tabs>
+        <w:ind w:left="0" w:hanging="0"/>
+      </w:pPr>
+    </w:lvl>
+    <w:lvl w:ilvl="8">
+      <w:start w:val="1"/>
+      <w:numFmt w:val="none"/>
+      <w:suff w:val="nothing"/>
+      <w:lvlText w:val=""/>
+      <w:lvlJc w:val="left"/>
+      <w:pPr>
+        <w:tabs>
+          <w:tab w:val="num" w:pos="0"/>
+        </w:tabs>
+        <w:ind w:left="0" w:hanging="0"/>
       </w:pPr>
     </w:lvl>
   </w:abstractNum>
@@ -9566,10 +9688,25 @@
     <w:abstractNumId w:val="2"/>
   </w:num>
   <w:num w:numId="3">
+    <w:abstractNumId w:val="3"/>
+  </w:num>
+  <w:num w:numId="4">
     <w:abstractNumId w:val="2"/>
     <w:lvlOverride w:ilvl="0">
       <w:startOverride w:val="1"/>
     </w:lvlOverride>
+  </w:num>
+  <w:num w:numId="5">
+    <w:abstractNumId w:val="2"/>
+  </w:num>
+  <w:num w:numId="6">
+    <w:abstractNumId w:val="2"/>
+  </w:num>
+  <w:num w:numId="7">
+    <w:abstractNumId w:val="2"/>
+  </w:num>
+  <w:num w:numId="8">
+    <w:abstractNumId w:val="2"/>
   </w:num>
 </w:numbering>
 </file>
@@ -9596,6 +9733,7 @@
     <w:qFormat/>
     <w:pPr>
       <w:widowControl/>
+      <w:suppressAutoHyphens w:val="true"/>
       <w:bidi w:val="0"/>
       <w:spacing w:before="0" w:after="0"/>
       <w:jc w:val="left"/>
@@ -9821,6 +9959,7 @@
     <w:qFormat/>
     <w:pPr>
       <w:widowControl/>
+      <w:suppressAutoHyphens w:val="true"/>
       <w:bidi w:val="0"/>
       <w:spacing w:before="0" w:after="0"/>
       <w:jc w:val="left"/>
@@ -9841,6 +9980,7 @@
     <w:qFormat/>
     <w:pPr>
       <w:widowControl/>
+      <w:suppressAutoHyphens w:val="true"/>
       <w:bidi w:val="0"/>
       <w:spacing w:before="0" w:after="0"/>
       <w:jc w:val="left"/>

</xml_diff>